<commit_message>
docs: Chuan hoa ten Giang vien huong dan ThS. Nguyen Hoang Duy Thien tren toan bo he thong
</commit_message>
<xml_diff>
--- a/thesis/doc/265b35aca84ef16af3f71d878fd91f488bc99f03.docx
+++ b/thesis/doc/265b35aca84ef16af3f71d878fd91f488bc99f03.docx
@@ -104,13 +104,16 @@
           </w:tcPr>
           <w:p>
             <w:pPr>
-              <w:spacing w:line="276" w:lineRule="auto" w:before="40" w:after="40"/>
+              <w:jc w:val="left"/>
             </w:pPr>
             <w:r>
               <w:rPr>
+                <w:rFonts w:ascii="Times New Roman" w:hAnsi="Times New Roman"/>
+                <w:b/>
+                <w:color w:val="005C30"/>
                 <w:sz w:val="26"/>
               </w:rPr>
-              <w:t>ThS. Bộ môn Công Nghệ Phần Mềm</w:t>
+              <w:t>ThS. Nguyễn Hoàng Duy Thiện</w:t>
             </w:r>
           </w:p>
         </w:tc>
@@ -412,13 +415,16 @@
           </w:tcPr>
           <w:p>
             <w:pPr>
-              <w:spacing w:line="276" w:lineRule="auto" w:before="40" w:after="40"/>
+              <w:jc w:val="left"/>
             </w:pPr>
             <w:r>
               <w:rPr>
+                <w:rFonts w:ascii="Times New Roman" w:hAnsi="Times New Roman"/>
+                <w:b/>
+                <w:color w:val="005C30"/>
                 <w:sz w:val="26"/>
               </w:rPr>
-              <w:t>ThS. Bộ môn Công Nghệ Phần Mềm</w:t>
+              <w:t>ThS. Nguyễn Hoàng Duy Thiện</w:t>
             </w:r>
           </w:p>
         </w:tc>
@@ -856,13 +862,7 @@
         <w:jc w:val="both"/>
       </w:pPr>
       <w:r>
-        <w:rPr>
-          <w:rFonts w:ascii="Times New Roman" w:hAnsi="Times New Roman"/>
-          <w:b w:val="0"/>
-          <w:i w:val="0"/>
-          <w:sz w:val="26"/>
-        </w:rPr>
-        <w:t>Đặc biệt, em xin chân thành gửi lời cảm ơn sâu sắc nhất đến Giảng viên hướng dẫn. Thầy đã luôn tận tâm định hướng nghiên cứu, theo sát tiến độ, chỉ dẫn phương pháp triển khai và đưa ra những lời khuyên chuyên môn chuẩn xác giúp em hiện thực hóa thành công đề tài này.</w:t>
+        <w:t>Đặc biệt, em xin chân thành gửi lời cảm ơn sâu sắc nhất đến Giảng viên hướng dẫn - ThS. Nguyễn Hoàng Duy Thiện. Thầy đã luôn tận tâm định hướng nghiên cứu, theo sát tiến độ, chỉ dẫn phương pháp triển khai và đưa ra những lời khuyên chuyên môn chuẩn xác giúp em hiện thực hóa thành công đề tài này.</w:t>
       </w:r>
     </w:p>
     <w:p>

</xml_diff>

<commit_message>
docs: Cap nhat tieu de do an thanh: Xay dung Website ban thuc pham che bien tren nen tang cac phan mem ma nguon mo
</commit_message>
<xml_diff>
--- a/thesis/doc/265b35aca84ef16af3f71d878fd91f488bc99f03.docx
+++ b/thesis/doc/265b35aca84ef16af3f71d878fd91f488bc99f03.docx
@@ -51,20 +51,14 @@
       </w:pPr>
       <w:r>
         <w:rPr>
+          <w:rFonts w:ascii="Times New Roman" w:hAnsi="Times New Roman"/>
           <w:b/>
-          <w:color w:val="008848"/>
-          <w:sz w:val="34"/>
+          <w:color w:val="005C30"/>
+          <w:sz w:val="32"/>
         </w:rPr>
-        <w:t>XÂY DỰNG WEBSITE BÁN THỰC PHẨM CHẾ BIẾN ĐẶC SẢN BẾN TRE TRÊN NỀN TẢNG MÃ NGUỒN MỞ LAMP VÀ WORDPRESS</w:t>
+        <w:t>XÂY DỰNG WEBSITE BÁN THỰC PHẨM CHẾ BIẾN TRÊN NỀN TẢNG CÁC PHẦN MỀM MÃ NGUỒN MỞ</w:t>
         <w:br/>
-      </w:r>
-      <w:r>
-        <w:rPr>
-          <w:i/>
-          <w:sz w:val="26"/>
-        </w:rPr>
         <w:t>(ỨNG DỤNG MÔ HÌNH THIẾT KẾ CHUỖI SIÊU THỊ BÁCH HÓA XANH)</w:t>
-        <w:br/>
         <w:br/>
         <w:br/>
         <w:br/>
@@ -362,20 +356,14 @@
       </w:pPr>
       <w:r>
         <w:rPr>
+          <w:rFonts w:ascii="Times New Roman" w:hAnsi="Times New Roman"/>
           <w:b/>
-          <w:color w:val="008848"/>
-          <w:sz w:val="34"/>
+          <w:color w:val="005C30"/>
+          <w:sz w:val="32"/>
         </w:rPr>
-        <w:t>XÂY DỰNG WEBSITE BÁN THỰC PHẨM CHẾ BIẾN ĐẶC SẢN BẾN TRE TRÊN NỀN TẢNG MÃ NGUỒN MỞ LAMP VÀ WORDPRESS</w:t>
+        <w:t>XÂY DỰNG WEBSITE BÁN THỰC PHẨM CHẾ BIẾN TRÊN NỀN TẢNG CÁC PHẦN MỀM MÃ NGUỒN MỞ</w:t>
         <w:br/>
-      </w:r>
-      <w:r>
-        <w:rPr>
-          <w:i/>
-          <w:sz w:val="26"/>
-        </w:rPr>
         <w:t>(ỨNG DỤNG MÔ HÌNH THIẾT KẾ CHUỖI SIÊU THỊ BÁCH HÓA XANH)</w:t>
-        <w:br/>
         <w:br/>
         <w:br/>
         <w:br/>
@@ -664,11 +652,16 @@
       <w:r>
         <w:rPr>
           <w:rFonts w:ascii="Times New Roman" w:hAnsi="Times New Roman"/>
-          <w:b w:val="0"/>
-          <w:i w:val="0"/>
-          <w:sz w:val="26"/>
+          <w:b/>
+          <w:color w:val="005C30"/>
+          <w:sz w:val="32"/>
         </w:rPr>
-        <w:t>Tên đề tài: Xây dựng Website bán thực phẩm chế biến đặc sản Bến Tre trên nền tảng mã nguồn mở LAMP và CMS WordPress (Phong cách Bách Hóa Xanh).</w:t>
+        <w:t>XÂY DỰNG WEBSITE BÁN THỰC PHẨM CHẾ BIẾN TRÊN NỀN TẢNG CÁC PHẦN MỀM MÃ NGUỒN MỞ</w:t>
+        <w:br/>
+        <w:t>(ỨNG DỤNG MÔ HÌNH THIẾT KẾ CHUỖI SIÊU THỊ BÁCH HÓA XANH)</w:t>
+        <w:br/>
+        <w:br/>
+        <w:br/>
       </w:r>
     </w:p>
     <w:p>

</xml_diff>